<commit_message>
docs: add UI metric lineage guide
</commit_message>
<xml_diff>
--- a/docs/word/00_DANH_MUC_BO_HO_SO_C360.docx
+++ b/docs/word/00_DANH_MUC_BO_HO_SO_C360.docx
@@ -932,7 +932,7 @@
         <w:t xml:space="preserve">Phiên bản:</w:t>
       </w:r>
       <w:r>
-        <w:t xml:space="preserve"> 2.0</w:t>
+        <w:t xml:space="preserve"> 2.1</w:t>
       </w:r>
     </w:p>
     <w:p>
@@ -1400,7 +1400,7 @@
               <w:spacing w:before="0" w:after="0"/>
             </w:pPr>
             <w:r>
-              <w:t xml:space="preserve">C360-SEC-05</w:t>
+              <w:t xml:space="preserve">C360-LIN-04</w:t>
             </w:r>
           </w:p>
         </w:tc>
@@ -1419,55 +1419,55 @@
                 <w:color w:val="8A1538"/>
                 <w:sz w:val="18"/>
               </w:rPr>
-              <w:t xml:space="preserve">MA_TRAN_PHAN_QUYEN_VA_BAO_MAT_C360.md</w:t>
-            </w:r>
-          </w:p>
-        </w:tc>
-        <w:tc>
-          <w:tcPr>
-            <w:tcW w:w="2360" w:type="dxa"/>
-          </w:tcPr>
-          <w:p>
-            <w:pPr>
-              <w:pStyle w:val="TableText"/>
-              <w:spacing w:before="0" w:after="0"/>
-            </w:pPr>
-            <w:r>
-              <w:t xml:space="preserve">Quản trị quyền, kiểm soát</w:t>
-            </w:r>
-          </w:p>
-        </w:tc>
-        <w:tc>
-          <w:tcPr>
-            <w:tcW w:w="2360" w:type="dxa"/>
-          </w:tcPr>
-          <w:p>
-            <w:pPr>
-              <w:pStyle w:val="TableText"/>
-              <w:spacing w:before="0" w:after="0"/>
-            </w:pPr>
-            <w:r>
-              <w:t xml:space="preserve">Role, scope, quyền nhạy cảm, phiên và audit</w:t>
-            </w:r>
-          </w:p>
-        </w:tc>
-      </w:tr>
-      <w:tr>
-        <w:trPr>
-          <w:cantSplit/>
-        </w:trPr>
-        <w:tc>
-          <w:tcPr>
-            <w:tcW w:w="2360" w:type="dxa"/>
-            <w:shd w:fill="F8FAFB"/>
-          </w:tcPr>
-          <w:p>
-            <w:pPr>
-              <w:pStyle w:val="TableText"/>
-              <w:spacing w:before="0" w:after="0"/>
-            </w:pPr>
-            <w:r>
-              <w:t xml:space="preserve">C360-ARC-10</w:t>
+              <w:t xml:space="preserve">TRUY_VET_CHI_TIEU_GIAO_DIEN_C360.md</w:t>
+            </w:r>
+          </w:p>
+        </w:tc>
+        <w:tc>
+          <w:tcPr>
+            <w:tcW w:w="2360" w:type="dxa"/>
+          </w:tcPr>
+          <w:p>
+            <w:pPr>
+              <w:pStyle w:val="TableText"/>
+              <w:spacing w:before="0" w:after="0"/>
+            </w:pPr>
+            <w:r>
+              <w:t xml:space="preserve">Nghiệp vụ, kiểm soát, phát triển</w:t>
+            </w:r>
+          </w:p>
+        </w:tc>
+        <w:tc>
+          <w:tcPr>
+            <w:tcW w:w="2360" w:type="dxa"/>
+          </w:tcPr>
+          <w:p>
+            <w:pPr>
+              <w:pStyle w:val="TableText"/>
+              <w:spacing w:before="0" w:after="0"/>
+            </w:pPr>
+            <w:r>
+              <w:t xml:space="preserve">Từng card/cột/biểu đồ lấy từ nguồn, cột và công thức nào</w:t>
+            </w:r>
+          </w:p>
+        </w:tc>
+      </w:tr>
+      <w:tr>
+        <w:trPr>
+          <w:cantSplit/>
+        </w:trPr>
+        <w:tc>
+          <w:tcPr>
+            <w:tcW w:w="2360" w:type="dxa"/>
+            <w:shd w:fill="F8FAFB"/>
+          </w:tcPr>
+          <w:p>
+            <w:pPr>
+              <w:pStyle w:val="TableText"/>
+              <w:spacing w:before="0" w:after="0"/>
+            </w:pPr>
+            <w:r>
+              <w:t xml:space="preserve">C360-SEC-05</w:t>
             </w:r>
           </w:p>
         </w:tc>
@@ -1487,56 +1487,56 @@
                 <w:color w:val="8A1538"/>
                 <w:sz w:val="18"/>
               </w:rPr>
-              <w:t xml:space="preserve">KIEN_TRUC_HE_THONG_VA_ERD_C360.md</w:t>
-            </w:r>
-          </w:p>
-        </w:tc>
-        <w:tc>
-          <w:tcPr>
-            <w:tcW w:w="2360" w:type="dxa"/>
-            <w:shd w:fill="F8FAFB"/>
-          </w:tcPr>
-          <w:p>
-            <w:pPr>
-              <w:pStyle w:val="TableText"/>
-              <w:spacing w:before="0" w:after="0"/>
-            </w:pPr>
-            <w:r>
-              <w:t xml:space="preserve">Phát triển, quản trị kỹ thuật</w:t>
-            </w:r>
-          </w:p>
-        </w:tc>
-        <w:tc>
-          <w:tcPr>
-            <w:tcW w:w="2360" w:type="dxa"/>
-            <w:shd w:fill="F8FAFB"/>
-          </w:tcPr>
-          <w:p>
-            <w:pPr>
-              <w:pStyle w:val="TableText"/>
-              <w:spacing w:before="0" w:after="0"/>
-            </w:pPr>
-            <w:r>
-              <w:t xml:space="preserve">Kiến trúc, luồng dữ liệu, ERD và mở rộng</w:t>
-            </w:r>
-          </w:p>
-        </w:tc>
-      </w:tr>
-      <w:tr>
-        <w:trPr>
-          <w:cantSplit/>
-        </w:trPr>
-        <w:tc>
-          <w:tcPr>
-            <w:tcW w:w="2360" w:type="dxa"/>
-          </w:tcPr>
-          <w:p>
-            <w:pPr>
-              <w:pStyle w:val="TableText"/>
-              <w:spacing w:before="0" w:after="0"/>
-            </w:pPr>
-            <w:r>
-              <w:t xml:space="preserve">C360-REG-00</w:t>
+              <w:t xml:space="preserve">MA_TRAN_PHAN_QUYEN_VA_BAO_MAT_C360.md</w:t>
+            </w:r>
+          </w:p>
+        </w:tc>
+        <w:tc>
+          <w:tcPr>
+            <w:tcW w:w="2360" w:type="dxa"/>
+            <w:shd w:fill="F8FAFB"/>
+          </w:tcPr>
+          <w:p>
+            <w:pPr>
+              <w:pStyle w:val="TableText"/>
+              <w:spacing w:before="0" w:after="0"/>
+            </w:pPr>
+            <w:r>
+              <w:t xml:space="preserve">Quản trị quyền, kiểm soát</w:t>
+            </w:r>
+          </w:p>
+        </w:tc>
+        <w:tc>
+          <w:tcPr>
+            <w:tcW w:w="2360" w:type="dxa"/>
+            <w:shd w:fill="F8FAFB"/>
+          </w:tcPr>
+          <w:p>
+            <w:pPr>
+              <w:pStyle w:val="TableText"/>
+              <w:spacing w:before="0" w:after="0"/>
+            </w:pPr>
+            <w:r>
+              <w:t xml:space="preserve">Role, scope, quyền nhạy cảm, phiên và audit</w:t>
+            </w:r>
+          </w:p>
+        </w:tc>
+      </w:tr>
+      <w:tr>
+        <w:trPr>
+          <w:cantSplit/>
+        </w:trPr>
+        <w:tc>
+          <w:tcPr>
+            <w:tcW w:w="2360" w:type="dxa"/>
+          </w:tcPr>
+          <w:p>
+            <w:pPr>
+              <w:pStyle w:val="TableText"/>
+              <w:spacing w:before="0" w:after="0"/>
+            </w:pPr>
+            <w:r>
+              <w:t xml:space="preserve">C360-ARC-10</w:t>
             </w:r>
           </w:p>
         </w:tc>
@@ -1555,6 +1555,74 @@
                 <w:color w:val="8A1538"/>
                 <w:sz w:val="18"/>
               </w:rPr>
+              <w:t xml:space="preserve">KIEN_TRUC_HE_THONG_VA_ERD_C360.md</w:t>
+            </w:r>
+          </w:p>
+        </w:tc>
+        <w:tc>
+          <w:tcPr>
+            <w:tcW w:w="2360" w:type="dxa"/>
+          </w:tcPr>
+          <w:p>
+            <w:pPr>
+              <w:pStyle w:val="TableText"/>
+              <w:spacing w:before="0" w:after="0"/>
+            </w:pPr>
+            <w:r>
+              <w:t xml:space="preserve">Phát triển, quản trị kỹ thuật</w:t>
+            </w:r>
+          </w:p>
+        </w:tc>
+        <w:tc>
+          <w:tcPr>
+            <w:tcW w:w="2360" w:type="dxa"/>
+          </w:tcPr>
+          <w:p>
+            <w:pPr>
+              <w:pStyle w:val="TableText"/>
+              <w:spacing w:before="0" w:after="0"/>
+            </w:pPr>
+            <w:r>
+              <w:t xml:space="preserve">Kiến trúc, luồng dữ liệu, ERD và mở rộng</w:t>
+            </w:r>
+          </w:p>
+        </w:tc>
+      </w:tr>
+      <w:tr>
+        <w:trPr>
+          <w:cantSplit/>
+        </w:trPr>
+        <w:tc>
+          <w:tcPr>
+            <w:tcW w:w="2360" w:type="dxa"/>
+            <w:shd w:fill="F8FAFB"/>
+          </w:tcPr>
+          <w:p>
+            <w:pPr>
+              <w:pStyle w:val="TableText"/>
+              <w:spacing w:before="0" w:after="0"/>
+            </w:pPr>
+            <w:r>
+              <w:t xml:space="preserve">C360-REG-00</w:t>
+            </w:r>
+          </w:p>
+        </w:tc>
+        <w:tc>
+          <w:tcPr>
+            <w:tcW w:w="2360" w:type="dxa"/>
+            <w:shd w:fill="F8FAFB"/>
+          </w:tcPr>
+          <w:p>
+            <w:pPr>
+              <w:pStyle w:val="TableText"/>
+              <w:spacing w:before="0" w:after="0"/>
+            </w:pPr>
+            <w:r>
+              <w:rPr>
+                <w:rFonts w:ascii="Consolas" w:hAnsi="Consolas"/>
+                <w:color w:val="8A1538"/>
+                <w:sz w:val="18"/>
+              </w:rPr>
               <w:t xml:space="preserve">BO_HO_SO_TAI_LIEU_C360.md</w:t>
             </w:r>
           </w:p>
@@ -1562,6 +1630,7 @@
         <w:tc>
           <w:tcPr>
             <w:tcW w:w="2360" w:type="dxa"/>
+            <w:shd w:fill="F8FAFB"/>
           </w:tcPr>
           <w:p>
             <w:pPr>
@@ -1576,6 +1645,7 @@
         <w:tc>
           <w:tcPr>
             <w:tcW w:w="2360" w:type="dxa"/>
+            <w:shd w:fill="F8FAFB"/>
           </w:tcPr>
           <w:p>
             <w:pPr>
@@ -2060,7 +2130,17 @@
         <w:ind w:left="360"/>
       </w:pPr>
       <w:r>
-        <w:t xml:space="preserve">2. Từ điển dữ liệu khi cần hiểu trường/chỉ tiêu.</w:t>
+        <w:t xml:space="preserve">2. Truy vết chỉ tiêu giao diện khi cần hiểu con số lấy từ đâu và tính thế nào.</w:t>
+      </w:r>
+    </w:p>
+    <w:p>
+      <w:pPr>
+        <w:pStyle w:val="ListText"/>
+        <w:spacing w:before="0" w:after="70"/>
+        <w:ind w:left="360"/>
+      </w:pPr>
+      <w:r>
+        <w:t xml:space="preserve">3. Từ điển dữ liệu khi cần tra trạng thái từng trường.</w:t>
       </w:r>
     </w:p>
     <w:p>
@@ -2190,7 +2270,17 @@
         <w:ind w:left="360"/>
       </w:pPr>
       <w:r>
-        <w:t xml:space="preserve">3. Từ điển/mapping và tài liệu chuyên sâu liên quan.</w:t>
+        <w:t xml:space="preserve">3. Truy vết chỉ tiêu giao diện.</w:t>
+      </w:r>
+    </w:p>
+    <w:p>
+      <w:pPr>
+        <w:pStyle w:val="ListText"/>
+        <w:spacing w:before="0" w:after="70"/>
+        <w:ind w:left="360"/>
+      </w:pPr>
+      <w:r>
+        <w:t xml:space="preserve">4. Từ điển/mapping và tài liệu chuyên sâu liên quan.</w:t>
       </w:r>
     </w:p>
     <w:p>
@@ -2495,6 +2585,40 @@
               <w:spacing w:before="0" w:after="0"/>
             </w:pPr>
             <w:r>
+              <w:t xml:space="preserve">Card/cột/biểu đồ/công thức hiển thị</w:t>
+            </w:r>
+          </w:p>
+        </w:tc>
+        <w:tc>
+          <w:tcPr>
+            <w:tcW w:w="4720" w:type="dxa"/>
+            <w:shd w:fill="F8FAFB"/>
+          </w:tcPr>
+          <w:p>
+            <w:pPr>
+              <w:pStyle w:val="TableText"/>
+              <w:spacing w:before="0" w:after="0"/>
+            </w:pPr>
+            <w:r>
+              <w:t xml:space="preserve">Truy vết chỉ tiêu giao diện + hướng dẫn sử dụng</w:t>
+            </w:r>
+          </w:p>
+        </w:tc>
+      </w:tr>
+      <w:tr>
+        <w:trPr>
+          <w:cantSplit/>
+        </w:trPr>
+        <w:tc>
+          <w:tcPr>
+            <w:tcW w:w="4720" w:type="dxa"/>
+          </w:tcPr>
+          <w:p>
+            <w:pPr>
+              <w:pStyle w:val="TableText"/>
+              <w:spacing w:before="0" w:after="0"/>
+            </w:pPr>
+            <w:r>
               <w:t xml:space="preserve">Nguồn/cột/công thức</w:t>
             </w:r>
           </w:p>
@@ -2502,26 +2626,26 @@
         <w:tc>
           <w:tcPr>
             <w:tcW w:w="4720" w:type="dxa"/>
-            <w:shd w:fill="F8FAFB"/>
-          </w:tcPr>
-          <w:p>
-            <w:pPr>
-              <w:pStyle w:val="TableText"/>
-              <w:spacing w:before="0" w:after="0"/>
-            </w:pPr>
-            <w:r>
-              <w:t xml:space="preserve">Đặc tả nguồn + từ điển</w:t>
-            </w:r>
-          </w:p>
-        </w:tc>
-      </w:tr>
-      <w:tr>
-        <w:trPr>
-          <w:cantSplit/>
-        </w:trPr>
-        <w:tc>
-          <w:tcPr>
-            <w:tcW w:w="4720" w:type="dxa"/>
+          </w:tcPr>
+          <w:p>
+            <w:pPr>
+              <w:pStyle w:val="TableText"/>
+              <w:spacing w:before="0" w:after="0"/>
+            </w:pPr>
+            <w:r>
+              <w:t xml:space="preserve">Đặc tả nguồn + truy vết chỉ tiêu + từ điển</w:t>
+            </w:r>
+          </w:p>
+        </w:tc>
+      </w:tr>
+      <w:tr>
+        <w:trPr>
+          <w:cantSplit/>
+        </w:trPr>
+        <w:tc>
+          <w:tcPr>
+            <w:tcW w:w="4720" w:type="dxa"/>
+            <w:shd w:fill="F8FAFB"/>
           </w:tcPr>
           <w:p>
             <w:pPr>
@@ -2536,6 +2660,7 @@
         <w:tc>
           <w:tcPr>
             <w:tcW w:w="4720" w:type="dxa"/>
+            <w:shd w:fill="F8FAFB"/>
           </w:tcPr>
           <w:p>
             <w:pPr>
@@ -2555,7 +2680,6 @@
         <w:tc>
           <w:tcPr>
             <w:tcW w:w="4720" w:type="dxa"/>
-            <w:shd w:fill="F8FAFB"/>
           </w:tcPr>
           <w:p>
             <w:pPr>
@@ -2570,7 +2694,6 @@
         <w:tc>
           <w:tcPr>
             <w:tcW w:w="4720" w:type="dxa"/>
-            <w:shd w:fill="F8FAFB"/>
           </w:tcPr>
           <w:p>
             <w:pPr>
@@ -2590,6 +2713,7 @@
         <w:tc>
           <w:tcPr>
             <w:tcW w:w="4720" w:type="dxa"/>
+            <w:shd w:fill="F8FAFB"/>
           </w:tcPr>
           <w:p>
             <w:pPr>
@@ -2604,6 +2728,7 @@
         <w:tc>
           <w:tcPr>
             <w:tcW w:w="4720" w:type="dxa"/>
+            <w:shd w:fill="F8FAFB"/>
           </w:tcPr>
           <w:p>
             <w:pPr>
@@ -2623,7 +2748,6 @@
         <w:tc>
           <w:tcPr>
             <w:tcW w:w="4720" w:type="dxa"/>
-            <w:shd w:fill="F8FAFB"/>
           </w:tcPr>
           <w:p>
             <w:pPr>
@@ -2638,7 +2762,6 @@
         <w:tc>
           <w:tcPr>
             <w:tcW w:w="4720" w:type="dxa"/>
-            <w:shd w:fill="F8FAFB"/>
           </w:tcPr>
           <w:p>
             <w:pPr>

</xml_diff>